<commit_message>
Align photo credits and labels with their pictures in the AI lesson
</commit_message>
<xml_diff>
--- a/0478 P1/Artificial Intelligence/Artificial_Intelligence_Student_Booklet.docx
+++ b/0478 P1/Artificial Intelligence/Artificial_Intelligence_Student_Booklet.docx
@@ -4332,7 +4332,7 @@
       <w:pPr>
         <w:spacing w:after="95"/>
       </w:pPr>
-      <w:hyperlink w:history="1" r:id="rIddqtcixdsvi4ykpo9ln5hw">
+      <w:hyperlink w:history="1" r:id="rIdmauofluamax8um5qsj31m">
         <w:r>
           <w:rPr>
             <w:rStyle w:val="Hyperlink"/>
@@ -4349,7 +4349,7 @@
         </w:rPr>
         <w:t xml:space="preserve">  ·  </w:t>
       </w:r>
-      <w:hyperlink w:history="1" r:id="rIdv5qh5w52h6zqwoyj6xxcn">
+      <w:hyperlink w:history="1" r:id="rIdbfs0osmaaxu0skuyofrcy">
         <w:r>
           <w:rPr>
             <w:rStyle w:val="Hyperlink"/>
@@ -4380,7 +4380,7 @@
       <w:pPr>
         <w:spacing w:after="95"/>
       </w:pPr>
-      <w:hyperlink w:history="1" r:id="rIdwitxn3tp2itvqmbduld_9">
+      <w:hyperlink w:history="1" r:id="rId4ylql0bc3bxvdzeo79esb">
         <w:r>
           <w:rPr>
             <w:rStyle w:val="Hyperlink"/>
@@ -4397,7 +4397,7 @@
         </w:rPr>
         <w:t xml:space="preserve">  ·  </w:t>
       </w:r>
-      <w:hyperlink w:history="1" r:id="rIdvriq1nykszzbb4mt-gduf">
+      <w:hyperlink w:history="1" r:id="rIdn_wtwj-scktxbjbrg8haq">
         <w:r>
           <w:rPr>
             <w:rStyle w:val="Hyperlink"/>
@@ -4428,7 +4428,7 @@
       <w:pPr>
         <w:spacing w:after="95"/>
       </w:pPr>
-      <w:hyperlink w:history="1" r:id="rIdw3nqitsqkyabp-fq8agpl">
+      <w:hyperlink w:history="1" r:id="rIdvgjqijbyhocgwflp2ked1">
         <w:r>
           <w:rPr>
             <w:rStyle w:val="Hyperlink"/>
@@ -4445,7 +4445,7 @@
         </w:rPr>
         <w:t xml:space="preserve">  ·  </w:t>
       </w:r>
-      <w:hyperlink w:history="1" r:id="rIdlweowbiw-u9fgwghzyw-p">
+      <w:hyperlink w:history="1" r:id="rIdhljimyvpevkrf6lax6icu">
         <w:r>
           <w:rPr>
             <w:rStyle w:val="Hyperlink"/>
@@ -4476,7 +4476,7 @@
       <w:pPr>
         <w:spacing w:after="95"/>
       </w:pPr>
-      <w:hyperlink w:history="1" r:id="rIdlgebhelwwbfn4yvm6kdhk">
+      <w:hyperlink w:history="1" r:id="rIds_t7ptp3wn3rqefabawco">
         <w:r>
           <w:rPr>
             <w:rStyle w:val="Hyperlink"/>
@@ -4493,7 +4493,7 @@
         </w:rPr>
         <w:t xml:space="preserve">  ·  </w:t>
       </w:r>
-      <w:hyperlink w:history="1" r:id="rIdgouly4abqmtpzseoidpwk">
+      <w:hyperlink w:history="1" r:id="rIda9hm0a9iuhap0qijh-t4g">
         <w:r>
           <w:rPr>
             <w:rStyle w:val="Hyperlink"/>
@@ -4524,7 +4524,7 @@
       <w:pPr>
         <w:spacing w:after="95"/>
       </w:pPr>
-      <w:hyperlink w:history="1" r:id="rIdsebqw6kuinhmzc8bjgxft">
+      <w:hyperlink w:history="1" r:id="rIdcwgxkpy_czkrzlykzq8tt">
         <w:r>
           <w:rPr>
             <w:rStyle w:val="Hyperlink"/>
@@ -4541,7 +4541,7 @@
         </w:rPr>
         <w:t xml:space="preserve">  ·  </w:t>
       </w:r>
-      <w:hyperlink w:history="1" r:id="rIdeii4pozvdchrnbcjkbxpm">
+      <w:hyperlink w:history="1" r:id="rIdoofzya-eivlrkuzftvbgj">
         <w:r>
           <w:rPr>
             <w:rStyle w:val="Hyperlink"/>
@@ -4572,7 +4572,7 @@
       <w:pPr>
         <w:spacing w:after="95"/>
       </w:pPr>
-      <w:hyperlink w:history="1" r:id="rIdtu8x1usobdkzizl6yowhl">
+      <w:hyperlink w:history="1" r:id="rIdh1v5sm1mrwbaiv4m9vccc">
         <w:r>
           <w:rPr>
             <w:rStyle w:val="Hyperlink"/>
@@ -4589,7 +4589,7 @@
         </w:rPr>
         <w:t xml:space="preserve">  ·  </w:t>
       </w:r>
-      <w:hyperlink w:history="1" r:id="rIdz8wlsowyvqm9rzyay6bd3">
+      <w:hyperlink w:history="1" r:id="rIdpbfpqrqfaz_-rfxg3xp5i">
         <w:r>
           <w:rPr>
             <w:rStyle w:val="Hyperlink"/>
@@ -4620,7 +4620,7 @@
       <w:pPr>
         <w:spacing w:after="95"/>
       </w:pPr>
-      <w:hyperlink w:history="1" r:id="rIda1qjysah_z1ujohwwol1l">
+      <w:hyperlink w:history="1" r:id="rIdsdpdfgnzzgv0rzv82vbvl">
         <w:r>
           <w:rPr>
             <w:rStyle w:val="Hyperlink"/>
@@ -4637,7 +4637,7 @@
         </w:rPr>
         <w:t xml:space="preserve">  ·  </w:t>
       </w:r>
-      <w:hyperlink w:history="1" r:id="rId8egy-nyusjvk4dkhbni9k">
+      <w:hyperlink w:history="1" r:id="rIdpgztzkxip9mykczi2q2cu">
         <w:r>
           <w:rPr>
             <w:rStyle w:val="Hyperlink"/>
@@ -4668,7 +4668,7 @@
       <w:pPr>
         <w:spacing w:after="95"/>
       </w:pPr>
-      <w:hyperlink w:history="1" r:id="rId6fifrpsrhovhpara3inlf">
+      <w:hyperlink w:history="1" r:id="rIdg5_z43yxojayymct09x54">
         <w:r>
           <w:rPr>
             <w:rStyle w:val="Hyperlink"/>
@@ -4685,7 +4685,7 @@
         </w:rPr>
         <w:t xml:space="preserve">  ·  </w:t>
       </w:r>
-      <w:hyperlink w:history="1" r:id="rIdg8dcztn9ssljq2cusj5tb">
+      <w:hyperlink w:history="1" r:id="rId-zh6y2dbsh0_gethynfq1">
         <w:r>
           <w:rPr>
             <w:rStyle w:val="Hyperlink"/>
@@ -4716,7 +4716,7 @@
       <w:pPr>
         <w:spacing w:after="95"/>
       </w:pPr>
-      <w:hyperlink w:history="1" r:id="rIdl_5e284dq8rzlaigwob2h">
+      <w:hyperlink w:history="1" r:id="rIdhqlpedv748w7hnnmq7y57">
         <w:r>
           <w:rPr>
             <w:rStyle w:val="Hyperlink"/>
@@ -4733,7 +4733,7 @@
         </w:rPr>
         <w:t xml:space="preserve">  ·  </w:t>
       </w:r>
-      <w:hyperlink w:history="1" r:id="rId-pufvruoynob3_elen6nn">
+      <w:hyperlink w:history="1" r:id="rId3qp16o2ilbfuipds4eee0">
         <w:r>
           <w:rPr>
             <w:rStyle w:val="Hyperlink"/>
@@ -4764,7 +4764,7 @@
       <w:pPr>
         <w:spacing w:after="95"/>
       </w:pPr>
-      <w:hyperlink w:history="1" r:id="rIdwic8zakg9uqcjj61or4y_">
+      <w:hyperlink w:history="1" r:id="rIdmu_hy4pj8sizbycqqe6m5">
         <w:r>
           <w:rPr>
             <w:rStyle w:val="Hyperlink"/>
@@ -4781,7 +4781,7 @@
         </w:rPr>
         <w:t xml:space="preserve">  ·  </w:t>
       </w:r>
-      <w:hyperlink w:history="1" r:id="rId_78iwv_qaprrjimf07zcy">
+      <w:hyperlink w:history="1" r:id="rIdpv8ib4csq8u8lboizwjaz">
         <w:r>
           <w:rPr>
             <w:rStyle w:val="Hyperlink"/>
@@ -4812,7 +4812,7 @@
       <w:pPr>
         <w:spacing w:after="95"/>
       </w:pPr>
-      <w:hyperlink w:history="1" r:id="rIdmuixfzp0kko9dudm0tiaq">
+      <w:hyperlink w:history="1" r:id="rIdjshb1b3wovr0pt8ncx8_d">
         <w:r>
           <w:rPr>
             <w:rStyle w:val="Hyperlink"/>
@@ -4829,7 +4829,7 @@
         </w:rPr>
         <w:t xml:space="preserve">  ·  </w:t>
       </w:r>
-      <w:hyperlink w:history="1" r:id="rIdjgl-ennqqewnmgdi-t75-">
+      <w:hyperlink w:history="1" r:id="rId7mqgskfmtshfn26fnnruv">
         <w:r>
           <w:rPr>
             <w:rStyle w:val="Hyperlink"/>
@@ -4860,7 +4860,7 @@
       <w:pPr>
         <w:spacing w:after="95"/>
       </w:pPr>
-      <w:hyperlink w:history="1" r:id="rId5xv4foellzncp57ejlxwi">
+      <w:hyperlink w:history="1" r:id="rId7udevcx9unajso4ryfrls">
         <w:r>
           <w:rPr>
             <w:rStyle w:val="Hyperlink"/>
@@ -4877,7 +4877,7 @@
         </w:rPr>
         <w:t xml:space="preserve">  ·  </w:t>
       </w:r>
-      <w:hyperlink w:history="1" r:id="rIdoqtm0b1dart-j7zu5lvqa">
+      <w:hyperlink w:history="1" r:id="rIdwayci2rkzrimzq1nyisdb">
         <w:r>
           <w:rPr>
             <w:rStyle w:val="Hyperlink"/>
@@ -4908,7 +4908,7 @@
       <w:pPr>
         <w:spacing w:after="95"/>
       </w:pPr>
-      <w:hyperlink w:history="1" r:id="rId_ratliv6openkrpmkd9uz">
+      <w:hyperlink w:history="1" r:id="rIdwurgkncei23z9obvgiym8">
         <w:r>
           <w:rPr>
             <w:rStyle w:val="Hyperlink"/>
@@ -4925,7 +4925,7 @@
         </w:rPr>
         <w:t xml:space="preserve">  ·  </w:t>
       </w:r>
-      <w:hyperlink w:history="1" r:id="rIddi4tqar-7bsip4wk7u-jj">
+      <w:hyperlink w:history="1" r:id="rIdj3vcvugjgkwgck4-siizh">
         <w:r>
           <w:rPr>
             <w:rStyle w:val="Hyperlink"/>
@@ -4956,7 +4956,7 @@
       <w:pPr>
         <w:spacing w:after="95"/>
       </w:pPr>
-      <w:hyperlink w:history="1" r:id="rIdxz7hspqkapfspwbshzi8x">
+      <w:hyperlink w:history="1" r:id="rId6xczppzwnm4yzct9p4fsg">
         <w:r>
           <w:rPr>
             <w:rStyle w:val="Hyperlink"/>
@@ -4973,7 +4973,7 @@
         </w:rPr>
         <w:t xml:space="preserve">  ·  </w:t>
       </w:r>
-      <w:hyperlink w:history="1" r:id="rIdocd2yw9wv5-ypbjhng_xt">
+      <w:hyperlink w:history="1" r:id="rIdqkncegw-kjpa-qtvpjr-g">
         <w:r>
           <w:rPr>
             <w:rStyle w:val="Hyperlink"/>
@@ -5004,7 +5004,7 @@
       <w:pPr>
         <w:spacing w:after="95"/>
       </w:pPr>
-      <w:hyperlink w:history="1" r:id="rIdw357kvglhjuhuvkatnexo">
+      <w:hyperlink w:history="1" r:id="rId5ztvmmn4pepfhdbspjwp_">
         <w:r>
           <w:rPr>
             <w:rStyle w:val="Hyperlink"/>
@@ -5021,7 +5021,7 @@
         </w:rPr>
         <w:t xml:space="preserve">  ·  </w:t>
       </w:r>
-      <w:hyperlink w:history="1" r:id="rId1u7v3se1oi6xoz9maoccf">
+      <w:hyperlink w:history="1" r:id="rId8cfnd_rraoulxzfxa_u9-">
         <w:r>
           <w:rPr>
             <w:rStyle w:val="Hyperlink"/>
@@ -5052,7 +5052,7 @@
       <w:pPr>
         <w:spacing w:after="95"/>
       </w:pPr>
-      <w:hyperlink w:history="1" r:id="rIdb9q9e6drytewgze18jd1t">
+      <w:hyperlink w:history="1" r:id="rIdoozpwnlnhk393uyvoxybh">
         <w:r>
           <w:rPr>
             <w:rStyle w:val="Hyperlink"/>
@@ -5069,7 +5069,7 @@
         </w:rPr>
         <w:t xml:space="preserve">  ·  </w:t>
       </w:r>
-      <w:hyperlink w:history="1" r:id="rIdfsmmp7gjulpflspmte9s7">
+      <w:hyperlink w:history="1" r:id="rIdk9ps7joxwedpwz8vg0xq3">
         <w:r>
           <w:rPr>
             <w:rStyle w:val="Hyperlink"/>
@@ -5100,7 +5100,7 @@
       <w:pPr>
         <w:spacing w:after="95"/>
       </w:pPr>
-      <w:hyperlink w:history="1" r:id="rIdx-txmvifyfrpjcvoyicky">
+      <w:hyperlink w:history="1" r:id="rIdgflp-idv4pfjrwm6iu1_n">
         <w:r>
           <w:rPr>
             <w:rStyle w:val="Hyperlink"/>
@@ -5117,7 +5117,7 @@
         </w:rPr>
         <w:t xml:space="preserve">  ·  </w:t>
       </w:r>
-      <w:hyperlink w:history="1" r:id="rIdd9uhgmoi9_edpskazazkz">
+      <w:hyperlink w:history="1" r:id="rId4olarqayt9tnqz0kb64tz">
         <w:r>
           <w:rPr>
             <w:rStyle w:val="Hyperlink"/>

</xml_diff>

<commit_message>
Define expert-system components using actual exam questions and schemes
</commit_message>
<xml_diff>
--- a/0478 P1/Artificial Intelligence/Artificial_Intelligence_Student_Booklet.docx
+++ b/0478 P1/Artificial Intelligence/Artificial_Intelligence_Student_Booklet.docx
@@ -4332,7 +4332,7 @@
       <w:pPr>
         <w:spacing w:after="95"/>
       </w:pPr>
-      <w:hyperlink w:history="1" r:id="rIdmauofluamax8um5qsj31m">
+      <w:hyperlink w:history="1" r:id="rIdekcrv-af0ysvrnkpw0hln">
         <w:r>
           <w:rPr>
             <w:rStyle w:val="Hyperlink"/>
@@ -4349,7 +4349,7 @@
         </w:rPr>
         <w:t xml:space="preserve">  ·  </w:t>
       </w:r>
-      <w:hyperlink w:history="1" r:id="rIdbfs0osmaaxu0skuyofrcy">
+      <w:hyperlink w:history="1" r:id="rIdctlgck36xg0nuhllf_i2v">
         <w:r>
           <w:rPr>
             <w:rStyle w:val="Hyperlink"/>
@@ -4380,7 +4380,7 @@
       <w:pPr>
         <w:spacing w:after="95"/>
       </w:pPr>
-      <w:hyperlink w:history="1" r:id="rId4ylql0bc3bxvdzeo79esb">
+      <w:hyperlink w:history="1" r:id="rId32qgi2ijikalurxprb8tw">
         <w:r>
           <w:rPr>
             <w:rStyle w:val="Hyperlink"/>
@@ -4397,7 +4397,7 @@
         </w:rPr>
         <w:t xml:space="preserve">  ·  </w:t>
       </w:r>
-      <w:hyperlink w:history="1" r:id="rIdn_wtwj-scktxbjbrg8haq">
+      <w:hyperlink w:history="1" r:id="rIdwvyhdwmluomupqit_p-q4">
         <w:r>
           <w:rPr>
             <w:rStyle w:val="Hyperlink"/>
@@ -4428,7 +4428,7 @@
       <w:pPr>
         <w:spacing w:after="95"/>
       </w:pPr>
-      <w:hyperlink w:history="1" r:id="rIdvgjqijbyhocgwflp2ked1">
+      <w:hyperlink w:history="1" r:id="rIdvy0qylzzdvl9hurwsctxm">
         <w:r>
           <w:rPr>
             <w:rStyle w:val="Hyperlink"/>
@@ -4445,7 +4445,7 @@
         </w:rPr>
         <w:t xml:space="preserve">  ·  </w:t>
       </w:r>
-      <w:hyperlink w:history="1" r:id="rIdhljimyvpevkrf6lax6icu">
+      <w:hyperlink w:history="1" r:id="rIdqbbxwvgbtv7lf4homkjtq">
         <w:r>
           <w:rPr>
             <w:rStyle w:val="Hyperlink"/>
@@ -4476,7 +4476,7 @@
       <w:pPr>
         <w:spacing w:after="95"/>
       </w:pPr>
-      <w:hyperlink w:history="1" r:id="rIds_t7ptp3wn3rqefabawco">
+      <w:hyperlink w:history="1" r:id="rId1-rklj5y2ovnbizapgnt6">
         <w:r>
           <w:rPr>
             <w:rStyle w:val="Hyperlink"/>
@@ -4493,7 +4493,7 @@
         </w:rPr>
         <w:t xml:space="preserve">  ·  </w:t>
       </w:r>
-      <w:hyperlink w:history="1" r:id="rIda9hm0a9iuhap0qijh-t4g">
+      <w:hyperlink w:history="1" r:id="rIdbhndxwlzm19xpcaxtvxrw">
         <w:r>
           <w:rPr>
             <w:rStyle w:val="Hyperlink"/>
@@ -4524,7 +4524,7 @@
       <w:pPr>
         <w:spacing w:after="95"/>
       </w:pPr>
-      <w:hyperlink w:history="1" r:id="rIdcwgxkpy_czkrzlykzq8tt">
+      <w:hyperlink w:history="1" r:id="rIdgznyoiv_k1d8mlmikyhhb">
         <w:r>
           <w:rPr>
             <w:rStyle w:val="Hyperlink"/>
@@ -4541,7 +4541,7 @@
         </w:rPr>
         <w:t xml:space="preserve">  ·  </w:t>
       </w:r>
-      <w:hyperlink w:history="1" r:id="rIdoofzya-eivlrkuzftvbgj">
+      <w:hyperlink w:history="1" r:id="rIdhv9k7c7bqwy1k66dnfewm">
         <w:r>
           <w:rPr>
             <w:rStyle w:val="Hyperlink"/>
@@ -4572,7 +4572,7 @@
       <w:pPr>
         <w:spacing w:after="95"/>
       </w:pPr>
-      <w:hyperlink w:history="1" r:id="rIdh1v5sm1mrwbaiv4m9vccc">
+      <w:hyperlink w:history="1" r:id="rIdpex3imkn_8pfqwpbslndx">
         <w:r>
           <w:rPr>
             <w:rStyle w:val="Hyperlink"/>
@@ -4589,7 +4589,7 @@
         </w:rPr>
         <w:t xml:space="preserve">  ·  </w:t>
       </w:r>
-      <w:hyperlink w:history="1" r:id="rIdpbfpqrqfaz_-rfxg3xp5i">
+      <w:hyperlink w:history="1" r:id="rIdtkfyky4xbwch8galtptl2">
         <w:r>
           <w:rPr>
             <w:rStyle w:val="Hyperlink"/>
@@ -4620,7 +4620,7 @@
       <w:pPr>
         <w:spacing w:after="95"/>
       </w:pPr>
-      <w:hyperlink w:history="1" r:id="rIdsdpdfgnzzgv0rzv82vbvl">
+      <w:hyperlink w:history="1" r:id="rIdxwqm5zoy3z-iv7tbxahfn">
         <w:r>
           <w:rPr>
             <w:rStyle w:val="Hyperlink"/>
@@ -4637,7 +4637,7 @@
         </w:rPr>
         <w:t xml:space="preserve">  ·  </w:t>
       </w:r>
-      <w:hyperlink w:history="1" r:id="rIdpgztzkxip9mykczi2q2cu">
+      <w:hyperlink w:history="1" r:id="rIdwoyrxavx72ijj6pltibhj">
         <w:r>
           <w:rPr>
             <w:rStyle w:val="Hyperlink"/>
@@ -4668,7 +4668,7 @@
       <w:pPr>
         <w:spacing w:after="95"/>
       </w:pPr>
-      <w:hyperlink w:history="1" r:id="rIdg5_z43yxojayymct09x54">
+      <w:hyperlink w:history="1" r:id="rId7kguxpisvldhsivy0tet_">
         <w:r>
           <w:rPr>
             <w:rStyle w:val="Hyperlink"/>
@@ -4685,7 +4685,7 @@
         </w:rPr>
         <w:t xml:space="preserve">  ·  </w:t>
       </w:r>
-      <w:hyperlink w:history="1" r:id="rId-zh6y2dbsh0_gethynfq1">
+      <w:hyperlink w:history="1" r:id="rIdn1wnv-ezapgknq5kox19s">
         <w:r>
           <w:rPr>
             <w:rStyle w:val="Hyperlink"/>
@@ -4716,7 +4716,7 @@
       <w:pPr>
         <w:spacing w:after="95"/>
       </w:pPr>
-      <w:hyperlink w:history="1" r:id="rIdhqlpedv748w7hnnmq7y57">
+      <w:hyperlink w:history="1" r:id="rIdy-xumkm6sw_oo5wy0tfyu">
         <w:r>
           <w:rPr>
             <w:rStyle w:val="Hyperlink"/>
@@ -4733,7 +4733,7 @@
         </w:rPr>
         <w:t xml:space="preserve">  ·  </w:t>
       </w:r>
-      <w:hyperlink w:history="1" r:id="rId3qp16o2ilbfuipds4eee0">
+      <w:hyperlink w:history="1" r:id="rIdq6t8ttqsub8n6-txlbs6f">
         <w:r>
           <w:rPr>
             <w:rStyle w:val="Hyperlink"/>
@@ -4764,7 +4764,7 @@
       <w:pPr>
         <w:spacing w:after="95"/>
       </w:pPr>
-      <w:hyperlink w:history="1" r:id="rIdmu_hy4pj8sizbycqqe6m5">
+      <w:hyperlink w:history="1" r:id="rIdwpz7hrh6xjjo4uhmt82rp">
         <w:r>
           <w:rPr>
             <w:rStyle w:val="Hyperlink"/>
@@ -4781,7 +4781,7 @@
         </w:rPr>
         <w:t xml:space="preserve">  ·  </w:t>
       </w:r>
-      <w:hyperlink w:history="1" r:id="rIdpv8ib4csq8u8lboizwjaz">
+      <w:hyperlink w:history="1" r:id="rIdep7ocnevs5kjxrpac_tyl">
         <w:r>
           <w:rPr>
             <w:rStyle w:val="Hyperlink"/>
@@ -4812,7 +4812,7 @@
       <w:pPr>
         <w:spacing w:after="95"/>
       </w:pPr>
-      <w:hyperlink w:history="1" r:id="rIdjshb1b3wovr0pt8ncx8_d">
+      <w:hyperlink w:history="1" r:id="rIdhrujfs07jyd2ex7clti4c">
         <w:r>
           <w:rPr>
             <w:rStyle w:val="Hyperlink"/>
@@ -4829,7 +4829,7 @@
         </w:rPr>
         <w:t xml:space="preserve">  ·  </w:t>
       </w:r>
-      <w:hyperlink w:history="1" r:id="rId7mqgskfmtshfn26fnnruv">
+      <w:hyperlink w:history="1" r:id="rIdklvn6ab8nomi29jdyayvj">
         <w:r>
           <w:rPr>
             <w:rStyle w:val="Hyperlink"/>
@@ -4860,7 +4860,7 @@
       <w:pPr>
         <w:spacing w:after="95"/>
       </w:pPr>
-      <w:hyperlink w:history="1" r:id="rId7udevcx9unajso4ryfrls">
+      <w:hyperlink w:history="1" r:id="rIdnhofew0sufav1_bg5owph">
         <w:r>
           <w:rPr>
             <w:rStyle w:val="Hyperlink"/>
@@ -4877,7 +4877,7 @@
         </w:rPr>
         <w:t xml:space="preserve">  ·  </w:t>
       </w:r>
-      <w:hyperlink w:history="1" r:id="rIdwayci2rkzrimzq1nyisdb">
+      <w:hyperlink w:history="1" r:id="rIdrqmguqgt6c4edhl3bnoc6">
         <w:r>
           <w:rPr>
             <w:rStyle w:val="Hyperlink"/>
@@ -4908,7 +4908,7 @@
       <w:pPr>
         <w:spacing w:after="95"/>
       </w:pPr>
-      <w:hyperlink w:history="1" r:id="rIdwurgkncei23z9obvgiym8">
+      <w:hyperlink w:history="1" r:id="rIdiqn8zl-xzybyt-1k_idt6">
         <w:r>
           <w:rPr>
             <w:rStyle w:val="Hyperlink"/>
@@ -4925,7 +4925,7 @@
         </w:rPr>
         <w:t xml:space="preserve">  ·  </w:t>
       </w:r>
-      <w:hyperlink w:history="1" r:id="rIdj3vcvugjgkwgck4-siizh">
+      <w:hyperlink w:history="1" r:id="rIdmzukkaueiiklehfl9efph">
         <w:r>
           <w:rPr>
             <w:rStyle w:val="Hyperlink"/>
@@ -4956,7 +4956,7 @@
       <w:pPr>
         <w:spacing w:after="95"/>
       </w:pPr>
-      <w:hyperlink w:history="1" r:id="rId6xczppzwnm4yzct9p4fsg">
+      <w:hyperlink w:history="1" r:id="rId3_yhx2bkpajop9awrrafo">
         <w:r>
           <w:rPr>
             <w:rStyle w:val="Hyperlink"/>
@@ -4973,7 +4973,7 @@
         </w:rPr>
         <w:t xml:space="preserve">  ·  </w:t>
       </w:r>
-      <w:hyperlink w:history="1" r:id="rIdqkncegw-kjpa-qtvpjr-g">
+      <w:hyperlink w:history="1" r:id="rId42sshcfqhonhhkvdd-gp7">
         <w:r>
           <w:rPr>
             <w:rStyle w:val="Hyperlink"/>
@@ -5004,7 +5004,7 @@
       <w:pPr>
         <w:spacing w:after="95"/>
       </w:pPr>
-      <w:hyperlink w:history="1" r:id="rId5ztvmmn4pepfhdbspjwp_">
+      <w:hyperlink w:history="1" r:id="rIdeiidg3oj0tgi02ojdyo9l">
         <w:r>
           <w:rPr>
             <w:rStyle w:val="Hyperlink"/>
@@ -5021,7 +5021,7 @@
         </w:rPr>
         <w:t xml:space="preserve">  ·  </w:t>
       </w:r>
-      <w:hyperlink w:history="1" r:id="rId8cfnd_rraoulxzfxa_u9-">
+      <w:hyperlink w:history="1" r:id="rIdtfgmbaoo739xv6hzdpj9o">
         <w:r>
           <w:rPr>
             <w:rStyle w:val="Hyperlink"/>
@@ -5052,7 +5052,7 @@
       <w:pPr>
         <w:spacing w:after="95"/>
       </w:pPr>
-      <w:hyperlink w:history="1" r:id="rIdoozpwnlnhk393uyvoxybh">
+      <w:hyperlink w:history="1" r:id="rIdhndbf7igsdi4wmktcvylz">
         <w:r>
           <w:rPr>
             <w:rStyle w:val="Hyperlink"/>
@@ -5069,7 +5069,7 @@
         </w:rPr>
         <w:t xml:space="preserve">  ·  </w:t>
       </w:r>
-      <w:hyperlink w:history="1" r:id="rIdk9ps7joxwedpwz8vg0xq3">
+      <w:hyperlink w:history="1" r:id="rId4w-bszr0xplkdasoxonsf">
         <w:r>
           <w:rPr>
             <w:rStyle w:val="Hyperlink"/>
@@ -5100,7 +5100,7 @@
       <w:pPr>
         <w:spacing w:after="95"/>
       </w:pPr>
-      <w:hyperlink w:history="1" r:id="rIdgflp-idv4pfjrwm6iu1_n">
+      <w:hyperlink w:history="1" r:id="rIdtyqpbyk68iahuxmxbx_p6">
         <w:r>
           <w:rPr>
             <w:rStyle w:val="Hyperlink"/>
@@ -5117,7 +5117,7 @@
         </w:rPr>
         <w:t xml:space="preserve">  ·  </w:t>
       </w:r>
-      <w:hyperlink w:history="1" r:id="rId4olarqayt9tnqz0kb64tz">
+      <w:hyperlink w:history="1" r:id="rId8xhxklea07gekcos5uif3">
         <w:r>
           <w:rPr>
             <w:rStyle w:val="Hyperlink"/>

</xml_diff>